<commit_message>
Correct manuscript author name
</commit_message>
<xml_diff>
--- a/manuscripts/covid19_symptom_classification_manuscript.docx
+++ b/manuscripts/covid19_symptom_classification_manuscript.docx
@@ -37,7 +37,7 @@
         <w:rPr>
           <w:b/>
         </w:rPr>
-        <w:t>Author: Edy King</w:t>
+        <w:t>Author: Edward Osikem Okhumaile</w:t>
       </w:r>
       <w:r>
         <w:t xml:space="preserve"> | GitHub: Edy-King | Prepared manuscript version: July 2026</w:t>
@@ -2121,7 +2121,7 @@
     </w:p>
     <w:p>
       <w:r>
-        <w:t>Author contributions: Edy King designed the analysis workflow, implemented the notebook, evaluated the models, interpreted the results, and prepared the manuscript.</w:t>
+        <w:t>Author contributions: Edward Osikem Okhumaile designed the analysis workflow, implemented the notebook, evaluated the models, interpreted the results, and prepared the manuscript.</w:t>
       </w:r>
     </w:p>
     <w:p>

</xml_diff>

<commit_message>
Update COVID publication manuscript
</commit_message>
<xml_diff>
--- a/manuscripts/covid19_symptom_classification_manuscript.docx
+++ b/manuscripts/covid19_symptom_classification_manuscript.docx
@@ -54,7 +54,7 @@
     </w:p>
     <w:p>
       <w:r>
-        <w:t>Background: Symptom-based screening remains a useful applied machine learning problem, especially where rapid triage or retrospective surveillance is required. Objective: This study evaluated seven supervised learning models for binary COVID-19 test-result classification using symptom indicators and basic testing-context features. Methods: I used 1,000,000 records from the Kaggle COVID-19 dataset for year 2020, retaining five symptom indicators and adding engineered features for symptom burden, age-over-60 status, gender, test indication, month, and weekday. Models were evaluated using accuracy, precision, recall, F1-score, ROC-AUC, and confusion matrices. The top three baseline models were tuned with randomized hyperparameter search. Results: Tuned LightGBM achieved the highest final ROC-AUC (0.743), with accuracy 0.923, precision 0.629, recall 0.381, and F1-score 0.474. Conclusion: Boosted tree models performed best overall, although performance was constrained by the limited feature set and class imbalance. The work provides a reproducible notebook-based benchmark rather than a clinical decision tool.</w:t>
+        <w:t>Background: Symptom-based screening remains a useful applied machine learning problem, especially where rapid triage or retrospective surveillance is required. Objective: This study evaluated seven supervised learning models for binary COVID-19 test-result classification using symptom indicators and basic testing-context features. Methods: I used 1,000,000 records from the Kaggle COVID-19 dataset for year 2020, retaining five symptom indicators and adding engineered features for symptom burden, age-over-60 status, gender, test indication, month, and weekday. Models were evaluated using accuracy, precision, recall, F1-score, ROC-AUC, and confusion matrices. The top three baseline models were tuned with randomized hyperparameter search. Results: Tuned LightGBM achieved the highest final ROC-AUC (0.743), with accuracy 0.923, precision 0.629, recall 0.381, and F1-score 0.474. Conclusion: Boosted tree models performed best overall, although performance was constrained by the limited feature set and class imbalance. The practical contribution is a reproducible comparison pattern that other machine learning professionals can adapt when judging whether added model complexity is justified for compact, imbalanced, symptom-style tabular data.</w:t>
       </w:r>
     </w:p>
     <w:p>
@@ -84,6 +84,11 @@
     <w:p>
       <w:r>
         <w:t>The contribution of this work is not a claim of clinical readiness. Instead, it is a reproducible modelling comparison that demonstrates efficient data loading, feature engineering, model evaluation, hyperparameter tuning, and artifact preservation using a large tabular dataset.</w:t>
+      </w:r>
+    </w:p>
+    <w:p>
+      <w:r>
+        <w:t>For machine learning practitioners, the project also shows how to turn a public health screening question into a disciplined classification workflow: define a compact feature set, engineer transparent symptom-burden variables, compare linear, ensemble, and boosted-tree models under the same split, and preserve the final artifact with metadata. This makes the work transferable to similar binary classification problems such as triage prioritization, service-demand screening, claims flagging, or other imbalanced decision-support tasks where the goal is to compare practical modelling trade-offs rather than to present a single black-box result.</w:t>
       </w:r>
     </w:p>
     <w:p>
@@ -2029,6 +2034,11 @@
       </w:r>
     </w:p>
     <w:p>
+      <w:r>
+        <w:t>The most useful lesson from the comparison is that evaluation should be tied to the intended operating context. In this dataset, several advanced models produced very similar headline scores, so the practical contribution lies in documenting the full decision path: memory-aware loading, transparent feature engineering, class-imbalance handling, multi-metric evaluation, and final artifact export. Other professionals can reuse this pattern to decide when a more complex model is worth deploying, when threshold adjustment matters more than model selection, and when additional data features are likely to be more valuable than further algorithm tuning.</w:t>
+      </w:r>
+    </w:p>
+    <w:p>
       <w:pPr>
         <w:pStyle w:val="Heading1"/>
       </w:pPr>

</xml_diff>